<commit_message>
refactor: neutralize vendor-specific terminology (shareable corpus)
Replace vendor-specific product/terminology with generic equivalents so
the public repo carries no product-name fingerprints:
  ECDS->PCS, CNIS->CaaS, DMC->CNPD, cSAEGW-C->SAEGW-C, cSAEGW-U->SAEGW-U,
  cMME->MME, EBM->EVM.

Applied across synthetic data (contents + filenames, via git mv),
extractor node IDs / ReleaseNote keys / provenance, graph_retrieval
aliases (old spellings kept as recall aliases), app, tests, and docs
(README, FEATURE-OVERVIEW, DOCUMENT-INVENTORY + regenerated .docx).
Graph rebuilt (36 nodes/69 edges) and corpus re-ingested; all 5 smoke
tests pass; anchor chain and cross-CNF questions verified under the new
names. Values/IDs were already synthetic; only the vocabulary changed.
</commit_message>
<xml_diff>
--- a/docs/DOCUMENT-INVENTORY.docx
+++ b/docs/DOCUMENT-INVENTORY.docx
@@ -2,13 +2,13 @@
 <file path=word/document.xml><?xml version="1.0" encoding="utf-8"?>
 <w:document xmlns:w="http://schemas.openxmlformats.org/wordprocessingml/2006/main" xmlns:m="http://schemas.openxmlformats.org/officeDocument/2006/math" xmlns:r="http://schemas.openxmlformats.org/officeDocument/2006/relationships" xmlns:o="urn:schemas-microsoft-com:office:office" xmlns:v="urn:schemas-microsoft-com:vml" xmlns:w10="urn:schemas-microsoft-com:office:word" xmlns:a="http://schemas.openxmlformats.org/drawingml/2006/main" xmlns:pic="http://schemas.openxmlformats.org/drawingml/2006/picture" xmlns:wp="http://schemas.openxmlformats.org/drawingml/2006/wordprocessingDrawing">
   <w:body>
-    <w:bookmarkStart w:id="27" w:name="dmc-delivery-graphrag-document-inventory"/>
+    <w:bookmarkStart w:id="27" w:name="Xf58127e58d5c44f1d1f734b5d2c923a1e3fab46"/>
     <w:p>
       <w:pPr>
         <w:pStyle w:val="Heading1"/>
       </w:pPr>
       <w:r>
-        <w:t xml:space="preserve">DMC Delivery GraphRAG — Document Inventory</w:t>
+        <w:t xml:space="preserve">CNPD Delivery GraphRAG — Document Inventory</w:t>
       </w:r>
     </w:p>
     <w:p>
@@ -26,7 +26,7 @@
         <w:t xml:space="preserve"> </w:t>
       </w:r>
       <w:r>
-        <w:t xml:space="preserve">telco-delivery-graphrag (learning/portfolio GraphRAG over a 5G/telecom DMC delivery lifecycle)</w:t>
+        <w:t xml:space="preserve">telco-delivery-graphrag (learning/portfolio GraphRAG over a 5G/telecom CNPD delivery lifecycle)</w:t>
       </w:r>
       <w:r>
         <w:t xml:space="preserve"> </w:t>
@@ -201,55 +201,55 @@
               <w:jc w:val="left"/>
             </w:pPr>
             <w:r>
-              <w:t xml:space="preserve">1</w:t>
-            </w:r>
-          </w:p>
-        </w:tc>
-        <w:tc>
-          <w:tcPr/>
-          <w:p>
-            <w:pPr>
-              <w:pStyle w:val="Compact"/>
-              <w:jc w:val="left"/>
-            </w:pPr>
-            <w:r>
-              <w:t xml:space="preserve">release-note-dmc-24.3.md</w:t>
-            </w:r>
-          </w:p>
-        </w:tc>
-        <w:tc>
-          <w:tcPr/>
-          <w:p>
-            <w:pPr>
-              <w:pStyle w:val="Compact"/>
-              <w:jc w:val="left"/>
-            </w:pPr>
-            <w:r>
-              <w:t xml:space="preserve">Release Note</w:t>
-            </w:r>
-          </w:p>
-        </w:tc>
-        <w:tc>
-          <w:tcPr/>
-          <w:p>
-            <w:pPr>
-              <w:pStyle w:val="Compact"/>
-              <w:jc w:val="left"/>
-            </w:pPr>
-            <w:r>
-              <w:t xml:space="preserve">NF versions, features, known issues, required procedures, gating</w:t>
-            </w:r>
-          </w:p>
-        </w:tc>
-        <w:tc>
-          <w:tcPr/>
-          <w:p>
-            <w:pPr>
-              <w:pStyle w:val="Compact"/>
-              <w:jc w:val="left"/>
-            </w:pPr>
-            <w:r>
-              <w:t xml:space="preserve">Vendor CNF/program release notes, software bulletins, CPI docs (PDF)</w:t>
+              <w:t xml:space="preserve">1a</w:t>
+            </w:r>
+          </w:p>
+        </w:tc>
+        <w:tc>
+          <w:tcPr/>
+          <w:p>
+            <w:pPr>
+              <w:pStyle w:val="Compact"/>
+              <w:jc w:val="left"/>
+            </w:pPr>
+            <w:r>
+              <w:t xml:space="preserve">release-note-saegw-c-24.3.0-cp.md</w:t>
+            </w:r>
+          </w:p>
+        </w:tc>
+        <w:tc>
+          <w:tcPr/>
+          <w:p>
+            <w:pPr>
+              <w:pStyle w:val="Compact"/>
+              <w:jc w:val="left"/>
+            </w:pPr>
+            <w:r>
+              <w:t xml:space="preserve">Release Note (per-CNF)</w:t>
+            </w:r>
+          </w:p>
+        </w:tc>
+        <w:tc>
+          <w:tcPr/>
+          <w:p>
+            <w:pPr>
+              <w:pStyle w:val="Compact"/>
+              <w:jc w:val="left"/>
+            </w:pPr>
+            <w:r>
+              <w:t xml:space="preserve">SAEGW-C features, fixed defects, known issues</w:t>
+            </w:r>
+          </w:p>
+        </w:tc>
+        <w:tc>
+          <w:tcPr/>
+          <w:p>
+            <w:pPr>
+              <w:pStyle w:val="Compact"/>
+              <w:jc w:val="left"/>
+            </w:pPr>
+            <w:r>
+              <w:t xml:space="preserve">Vendor per-CNF release note / software bulletin (PDF)</w:t>
             </w:r>
           </w:p>
         </w:tc>
@@ -263,55 +263,55 @@
               <w:jc w:val="left"/>
             </w:pPr>
             <w:r>
-              <w:t xml:space="preserve">2</w:t>
-            </w:r>
-          </w:p>
-        </w:tc>
-        <w:tc>
-          <w:tcPr/>
-          <w:p>
-            <w:pPr>
-              <w:pStyle w:val="Compact"/>
-              <w:jc w:val="left"/>
-            </w:pPr>
-            <w:r>
-              <w:t xml:space="preserve">mop-5521-upgrade-csaegw-c.md</w:t>
-            </w:r>
-          </w:p>
-        </w:tc>
-        <w:tc>
-          <w:tcPr/>
-          <w:p>
-            <w:pPr>
-              <w:pStyle w:val="Compact"/>
-              <w:jc w:val="left"/>
-            </w:pPr>
-            <w:r>
-              <w:t xml:space="preserve">MOP</w:t>
-            </w:r>
-          </w:p>
-        </w:tc>
-        <w:tc>
-          <w:tcPr/>
-          <w:p>
-            <w:pPr>
-              <w:pStyle w:val="Compact"/>
-              <w:jc w:val="left"/>
-            </w:pPr>
-            <w:r>
-              <w:t xml:space="preserve">Upgrade steps, prerequisites, rollback, post-checks</w:t>
-            </w:r>
-          </w:p>
-        </w:tc>
-        <w:tc>
-          <w:tcPr/>
-          <w:p>
-            <w:pPr>
-              <w:pStyle w:val="Compact"/>
-              <w:jc w:val="left"/>
-            </w:pPr>
-            <w:r>
-              <w:t xml:space="preserve">Method of Procedure / change runbook (ServiceNow/Remedy change record, Word/PDF)</w:t>
+              <w:t xml:space="preserve">1b</w:t>
+            </w:r>
+          </w:p>
+        </w:tc>
+        <w:tc>
+          <w:tcPr/>
+          <w:p>
+            <w:pPr>
+              <w:pStyle w:val="Compact"/>
+              <w:jc w:val="left"/>
+            </w:pPr>
+            <w:r>
+              <w:t xml:space="preserve">release-note-saegw-u-24.3.0-up.md, release-note-mme-24.3.1.md, release-note-pcc-7.2.0.md, release-note-pcg-7.2.0.md</w:t>
+            </w:r>
+          </w:p>
+        </w:tc>
+        <w:tc>
+          <w:tcPr/>
+          <w:p>
+            <w:pPr>
+              <w:pStyle w:val="Compact"/>
+              <w:jc w:val="left"/>
+            </w:pPr>
+            <w:r>
+              <w:t xml:space="preserve">Release Note (per-CNF)</w:t>
+            </w:r>
+          </w:p>
+        </w:tc>
+        <w:tc>
+          <w:tcPr/>
+          <w:p>
+            <w:pPr>
+              <w:pStyle w:val="Compact"/>
+              <w:jc w:val="left"/>
+            </w:pPr>
+            <w:r>
+              <w:t xml:space="preserve">One note per network function, each on its own version cadence</w:t>
+            </w:r>
+          </w:p>
+        </w:tc>
+        <w:tc>
+          <w:tcPr/>
+          <w:p>
+            <w:pPr>
+              <w:pStyle w:val="Compact"/>
+              <w:jc w:val="left"/>
+            </w:pPr>
+            <w:r>
+              <w:t xml:space="preserve">Vendor per-CNF release notes (PDF)</w:t>
             </w:r>
           </w:p>
         </w:tc>
@@ -325,55 +325,55 @@
               <w:jc w:val="left"/>
             </w:pPr>
             <w:r>
-              <w:t xml:space="preserve">3</w:t>
-            </w:r>
-          </w:p>
-        </w:tc>
-        <w:tc>
-          <w:tcPr/>
-          <w:p>
-            <w:pPr>
-              <w:pStyle w:val="Compact"/>
-              <w:jc w:val="left"/>
-            </w:pPr>
-            <w:r>
-              <w:t xml:space="preserve">ciq-8807-foa-parameters.md</w:t>
-            </w:r>
-          </w:p>
-        </w:tc>
-        <w:tc>
-          <w:tcPr/>
-          <w:p>
-            <w:pPr>
-              <w:pStyle w:val="Compact"/>
-              <w:jc w:val="left"/>
-            </w:pPr>
-            <w:r>
-              <w:t xml:space="preserve">CIQ</w:t>
-            </w:r>
-          </w:p>
-        </w:tc>
-        <w:tc>
-          <w:tcPr/>
-          <w:p>
-            <w:pPr>
-              <w:pStyle w:val="Compact"/>
-              <w:jc w:val="left"/>
-            </w:pPr>
-            <w:r>
-              <w:t xml:space="preserve">Per-environment parameters (pool size, heartbeat, policy profile, endpoints)</w:t>
-            </w:r>
-          </w:p>
-        </w:tc>
-        <w:tc>
-          <w:tcPr/>
-          <w:p>
-            <w:pPr>
-              <w:pStyle w:val="Compact"/>
-              <w:jc w:val="left"/>
-            </w:pPr>
-            <w:r>
-              <w:t xml:space="preserve">Customer Information Questionnaire — usually Excel/XLSX</w:t>
+              <w:t xml:space="preserve">1c</w:t>
+            </w:r>
+          </w:p>
+        </w:tc>
+        <w:tc>
+          <w:tcPr/>
+          <w:p>
+            <w:pPr>
+              <w:pStyle w:val="Compact"/>
+              <w:jc w:val="left"/>
+            </w:pPr>
+            <w:r>
+              <w:t xml:space="preserve">cnpd-24.3-integration-matrix.md</w:t>
+            </w:r>
+          </w:p>
+        </w:tc>
+        <w:tc>
+          <w:tcPr/>
+          <w:p>
+            <w:pPr>
+              <w:pStyle w:val="Compact"/>
+              <w:jc w:val="left"/>
+            </w:pPr>
+            <w:r>
+              <w:t xml:space="preserve">Integration/Compatibility Matrix</w:t>
+            </w:r>
+          </w:p>
+        </w:tc>
+        <w:tc>
+          <w:tcPr/>
+          <w:p>
+            <w:pPr>
+              <w:pStyle w:val="Compact"/>
+              <w:jc w:val="left"/>
+            </w:pPr>
+            <w:r>
+              <w:t xml:space="preserve">Which CNF versions are certified together; cross-CNF compatibility + minimum-version notes</w:t>
+            </w:r>
+          </w:p>
+        </w:tc>
+        <w:tc>
+          <w:tcPr/>
+          <w:p>
+            <w:pPr>
+              <w:pStyle w:val="Compact"/>
+              <w:jc w:val="left"/>
+            </w:pPr>
+            <w:r>
+              <w:t xml:space="preserve">Assembled integration/compatibility matrix (often Excel)</w:t>
             </w:r>
           </w:p>
         </w:tc>
@@ -387,55 +387,55 @@
               <w:jc w:val="left"/>
             </w:pPr>
             <w:r>
-              <w:t xml:space="preserve">4</w:t>
-            </w:r>
-          </w:p>
-        </w:tc>
-        <w:tc>
-          <w:tcPr/>
-          <w:p>
-            <w:pPr>
-              <w:pStyle w:val="Compact"/>
-              <w:jc w:val="left"/>
-            </w:pPr>
-            <w:r>
-              <w:t xml:space="preserve">nir-3310-implementation-record.md</w:t>
-            </w:r>
-          </w:p>
-        </w:tc>
-        <w:tc>
-          <w:tcPr/>
-          <w:p>
-            <w:pPr>
-              <w:pStyle w:val="Compact"/>
-              <w:jc w:val="left"/>
-            </w:pPr>
-            <w:r>
-              <w:t xml:space="preserve">NIR</w:t>
-            </w:r>
-          </w:p>
-        </w:tc>
-        <w:tc>
-          <w:tcPr/>
-          <w:p>
-            <w:pPr>
-              <w:pStyle w:val="Compact"/>
-              <w:jc w:val="left"/>
-            </w:pPr>
-            <w:r>
-              <w:t xml:space="preserve">Deployment topology, NFs per env, interfaces, environment progression</w:t>
-            </w:r>
-          </w:p>
-        </w:tc>
-        <w:tc>
-          <w:tcPr/>
-          <w:p>
-            <w:pPr>
-              <w:pStyle w:val="Compact"/>
-              <w:jc w:val="left"/>
-            </w:pPr>
-            <w:r>
-              <w:t xml:space="preserve">Network Implementation Record / As-Built / LLD</w:t>
+              <w:t xml:space="preserve">2</w:t>
+            </w:r>
+          </w:p>
+        </w:tc>
+        <w:tc>
+          <w:tcPr/>
+          <w:p>
+            <w:pPr>
+              <w:pStyle w:val="Compact"/>
+              <w:jc w:val="left"/>
+            </w:pPr>
+            <w:r>
+              <w:t xml:space="preserve">mop-5521-upgrade-saegw-c.md</w:t>
+            </w:r>
+          </w:p>
+        </w:tc>
+        <w:tc>
+          <w:tcPr/>
+          <w:p>
+            <w:pPr>
+              <w:pStyle w:val="Compact"/>
+              <w:jc w:val="left"/>
+            </w:pPr>
+            <w:r>
+              <w:t xml:space="preserve">MOP</w:t>
+            </w:r>
+          </w:p>
+        </w:tc>
+        <w:tc>
+          <w:tcPr/>
+          <w:p>
+            <w:pPr>
+              <w:pStyle w:val="Compact"/>
+              <w:jc w:val="left"/>
+            </w:pPr>
+            <w:r>
+              <w:t xml:space="preserve">Upgrade steps, prerequisites, rollback, post-checks</w:t>
+            </w:r>
+          </w:p>
+        </w:tc>
+        <w:tc>
+          <w:tcPr/>
+          <w:p>
+            <w:pPr>
+              <w:pStyle w:val="Compact"/>
+              <w:jc w:val="left"/>
+            </w:pPr>
+            <w:r>
+              <w:t xml:space="preserve">Method of Procedure / change runbook (ServiceNow/Remedy change record, Word/PDF)</w:t>
             </w:r>
           </w:p>
         </w:tc>
@@ -449,55 +449,55 @@
               <w:jc w:val="left"/>
             </w:pPr>
             <w:r>
-              <w:t xml:space="preserve">5</w:t>
-            </w:r>
-          </w:p>
-        </w:tc>
-        <w:tc>
-          <w:tcPr/>
-          <w:p>
-            <w:pPr>
-              <w:pStyle w:val="Compact"/>
-              <w:jc w:val="left"/>
-            </w:pPr>
-            <w:r>
-              <w:t xml:space="preserve">hld-packet-core-24.x.md</w:t>
-            </w:r>
-          </w:p>
-        </w:tc>
-        <w:tc>
-          <w:tcPr/>
-          <w:p>
-            <w:pPr>
-              <w:pStyle w:val="Compact"/>
-              <w:jc w:val="left"/>
-            </w:pPr>
-            <w:r>
-              <w:t xml:space="preserve">HLD</w:t>
-            </w:r>
-          </w:p>
-        </w:tc>
-        <w:tc>
-          <w:tcPr/>
-          <w:p>
-            <w:pPr>
-              <w:pStyle w:val="Compact"/>
-              <w:jc w:val="left"/>
-            </w:pPr>
-            <w:r>
-              <w:t xml:space="preserve">NFs, interfaces, environment model, delivery lifecycle</w:t>
-            </w:r>
-          </w:p>
-        </w:tc>
-        <w:tc>
-          <w:tcPr/>
-          <w:p>
-            <w:pPr>
-              <w:pStyle w:val="Compact"/>
-              <w:jc w:val="left"/>
-            </w:pPr>
-            <w:r>
-              <w:t xml:space="preserve">High-Level Design / solution design (Word/PDF + Visio)</w:t>
+              <w:t xml:space="preserve">3</w:t>
+            </w:r>
+          </w:p>
+        </w:tc>
+        <w:tc>
+          <w:tcPr/>
+          <w:p>
+            <w:pPr>
+              <w:pStyle w:val="Compact"/>
+              <w:jc w:val="left"/>
+            </w:pPr>
+            <w:r>
+              <w:t xml:space="preserve">ciq-8807-foa-parameters.md</w:t>
+            </w:r>
+          </w:p>
+        </w:tc>
+        <w:tc>
+          <w:tcPr/>
+          <w:p>
+            <w:pPr>
+              <w:pStyle w:val="Compact"/>
+              <w:jc w:val="left"/>
+            </w:pPr>
+            <w:r>
+              <w:t xml:space="preserve">CIQ</w:t>
+            </w:r>
+          </w:p>
+        </w:tc>
+        <w:tc>
+          <w:tcPr/>
+          <w:p>
+            <w:pPr>
+              <w:pStyle w:val="Compact"/>
+              <w:jc w:val="left"/>
+            </w:pPr>
+            <w:r>
+              <w:t xml:space="preserve">Per-environment parameters (pool size, heartbeat, policy profile, endpoints)</w:t>
+            </w:r>
+          </w:p>
+        </w:tc>
+        <w:tc>
+          <w:tcPr/>
+          <w:p>
+            <w:pPr>
+              <w:pStyle w:val="Compact"/>
+              <w:jc w:val="left"/>
+            </w:pPr>
+            <w:r>
+              <w:t xml:space="preserve">Customer Information Questionnaire — usually Excel/XLSX</w:t>
             </w:r>
           </w:p>
         </w:tc>
@@ -511,55 +511,55 @@
               <w:jc w:val="left"/>
             </w:pPr>
             <w:r>
-              <w:t xml:space="preserve">6</w:t>
-            </w:r>
-          </w:p>
-        </w:tc>
-        <w:tc>
-          <w:tcPr/>
-          <w:p>
-            <w:pPr>
-              <w:pStyle w:val="Compact"/>
-              <w:jc w:val="left"/>
-            </w:pPr>
-            <w:r>
-              <w:t xml:space="preserve">aat-test-results-dmc-24.3.md</w:t>
-            </w:r>
-          </w:p>
-        </w:tc>
-        <w:tc>
-          <w:tcPr/>
-          <w:p>
-            <w:pPr>
-              <w:pStyle w:val="Compact"/>
-              <w:jc w:val="left"/>
-            </w:pPr>
-            <w:r>
-              <w:t xml:space="preserve">Test Results</w:t>
-            </w:r>
-          </w:p>
-        </w:tc>
-        <w:tc>
-          <w:tcPr/>
-          <w:p>
-            <w:pPr>
-              <w:pStyle w:val="Compact"/>
-              <w:jc w:val="left"/>
-            </w:pPr>
-            <w:r>
-              <w:t xml:space="preserve">Pass/fail per test case, failure analysis, FOA readiness</w:t>
-            </w:r>
-          </w:p>
-        </w:tc>
-        <w:tc>
-          <w:tcPr/>
-          <w:p>
-            <w:pPr>
-              <w:pStyle w:val="Compact"/>
-              <w:jc w:val="left"/>
-            </w:pPr>
-            <w:r>
-              <w:t xml:space="preserve">AAT/UAT acceptance test report (ALM/qTest/Xray/TestRail export, Excel/PDF)</w:t>
+              <w:t xml:space="preserve">4</w:t>
+            </w:r>
+          </w:p>
+        </w:tc>
+        <w:tc>
+          <w:tcPr/>
+          <w:p>
+            <w:pPr>
+              <w:pStyle w:val="Compact"/>
+              <w:jc w:val="left"/>
+            </w:pPr>
+            <w:r>
+              <w:t xml:space="preserve">nir-3310-implementation-record.md</w:t>
+            </w:r>
+          </w:p>
+        </w:tc>
+        <w:tc>
+          <w:tcPr/>
+          <w:p>
+            <w:pPr>
+              <w:pStyle w:val="Compact"/>
+              <w:jc w:val="left"/>
+            </w:pPr>
+            <w:r>
+              <w:t xml:space="preserve">NIR</w:t>
+            </w:r>
+          </w:p>
+        </w:tc>
+        <w:tc>
+          <w:tcPr/>
+          <w:p>
+            <w:pPr>
+              <w:pStyle w:val="Compact"/>
+              <w:jc w:val="left"/>
+            </w:pPr>
+            <w:r>
+              <w:t xml:space="preserve">Deployment topology, NFs per env, interfaces, environment progression</w:t>
+            </w:r>
+          </w:p>
+        </w:tc>
+        <w:tc>
+          <w:tcPr/>
+          <w:p>
+            <w:pPr>
+              <w:pStyle w:val="Compact"/>
+              <w:jc w:val="left"/>
+            </w:pPr>
+            <w:r>
+              <w:t xml:space="preserve">Network Implementation Record / As-Built / LLD</w:t>
             </w:r>
           </w:p>
         </w:tc>
@@ -573,55 +573,55 @@
               <w:jc w:val="left"/>
             </w:pPr>
             <w:r>
-              <w:t xml:space="preserve">7</w:t>
-            </w:r>
-          </w:p>
-        </w:tc>
-        <w:tc>
-          <w:tcPr/>
-          <w:p>
-            <w:pPr>
-              <w:pStyle w:val="Compact"/>
-              <w:jc w:val="left"/>
-            </w:pPr>
-            <w:r>
-              <w:t xml:space="preserve">test-case-catalog-dmc-24.3.md</w:t>
-            </w:r>
-          </w:p>
-        </w:tc>
-        <w:tc>
-          <w:tcPr/>
-          <w:p>
-            <w:pPr>
-              <w:pStyle w:val="Compact"/>
-              <w:jc w:val="left"/>
-            </w:pPr>
-            <w:r>
-              <w:t xml:space="preserve">Test Catalog</w:t>
-            </w:r>
-          </w:p>
-        </w:tc>
-        <w:tc>
-          <w:tcPr/>
-          <w:p>
-            <w:pPr>
-              <w:pStyle w:val="Compact"/>
-              <w:jc w:val="left"/>
-            </w:pPr>
-            <w:r>
-              <w:t xml:space="preserve">Test cases with validates/preconditions/pass criteria</w:t>
-            </w:r>
-          </w:p>
-        </w:tc>
-        <w:tc>
-          <w:tcPr/>
-          <w:p>
-            <w:pPr>
-              <w:pStyle w:val="Compact"/>
-              <w:jc w:val="left"/>
-            </w:pPr>
-            <w:r>
-              <w:t xml:space="preserve">Test plan / test repository (ALM/Xray/TestRail, Excel)</w:t>
+              <w:t xml:space="preserve">5</w:t>
+            </w:r>
+          </w:p>
+        </w:tc>
+        <w:tc>
+          <w:tcPr/>
+          <w:p>
+            <w:pPr>
+              <w:pStyle w:val="Compact"/>
+              <w:jc w:val="left"/>
+            </w:pPr>
+            <w:r>
+              <w:t xml:space="preserve">hld-packet-core-24.x.md</w:t>
+            </w:r>
+          </w:p>
+        </w:tc>
+        <w:tc>
+          <w:tcPr/>
+          <w:p>
+            <w:pPr>
+              <w:pStyle w:val="Compact"/>
+              <w:jc w:val="left"/>
+            </w:pPr>
+            <w:r>
+              <w:t xml:space="preserve">HLD</w:t>
+            </w:r>
+          </w:p>
+        </w:tc>
+        <w:tc>
+          <w:tcPr/>
+          <w:p>
+            <w:pPr>
+              <w:pStyle w:val="Compact"/>
+              <w:jc w:val="left"/>
+            </w:pPr>
+            <w:r>
+              <w:t xml:space="preserve">NFs, interfaces, environment model, delivery lifecycle</w:t>
+            </w:r>
+          </w:p>
+        </w:tc>
+        <w:tc>
+          <w:tcPr/>
+          <w:p>
+            <w:pPr>
+              <w:pStyle w:val="Compact"/>
+              <w:jc w:val="left"/>
+            </w:pPr>
+            <w:r>
+              <w:t xml:space="preserve">High-Level Design / solution design (Word/PDF + Visio)</w:t>
             </w:r>
           </w:p>
         </w:tc>
@@ -635,6 +635,130 @@
               <w:jc w:val="left"/>
             </w:pPr>
             <w:r>
+              <w:t xml:space="preserve">6</w:t>
+            </w:r>
+          </w:p>
+        </w:tc>
+        <w:tc>
+          <w:tcPr/>
+          <w:p>
+            <w:pPr>
+              <w:pStyle w:val="Compact"/>
+              <w:jc w:val="left"/>
+            </w:pPr>
+            <w:r>
+              <w:t xml:space="preserve">aat-test-results-cnpd-24.3.md</w:t>
+            </w:r>
+          </w:p>
+        </w:tc>
+        <w:tc>
+          <w:tcPr/>
+          <w:p>
+            <w:pPr>
+              <w:pStyle w:val="Compact"/>
+              <w:jc w:val="left"/>
+            </w:pPr>
+            <w:r>
+              <w:t xml:space="preserve">Test Results</w:t>
+            </w:r>
+          </w:p>
+        </w:tc>
+        <w:tc>
+          <w:tcPr/>
+          <w:p>
+            <w:pPr>
+              <w:pStyle w:val="Compact"/>
+              <w:jc w:val="left"/>
+            </w:pPr>
+            <w:r>
+              <w:t xml:space="preserve">Pass/fail per test case, failure analysis, FOA readiness</w:t>
+            </w:r>
+          </w:p>
+        </w:tc>
+        <w:tc>
+          <w:tcPr/>
+          <w:p>
+            <w:pPr>
+              <w:pStyle w:val="Compact"/>
+              <w:jc w:val="left"/>
+            </w:pPr>
+            <w:r>
+              <w:t xml:space="preserve">AAT/UAT acceptance test report (ALM/qTest/Xray/TestRail export, Excel/PDF)</w:t>
+            </w:r>
+          </w:p>
+        </w:tc>
+      </w:tr>
+      <w:tr>
+        <w:tc>
+          <w:tcPr/>
+          <w:p>
+            <w:pPr>
+              <w:pStyle w:val="Compact"/>
+              <w:jc w:val="left"/>
+            </w:pPr>
+            <w:r>
+              <w:t xml:space="preserve">7</w:t>
+            </w:r>
+          </w:p>
+        </w:tc>
+        <w:tc>
+          <w:tcPr/>
+          <w:p>
+            <w:pPr>
+              <w:pStyle w:val="Compact"/>
+              <w:jc w:val="left"/>
+            </w:pPr>
+            <w:r>
+              <w:t xml:space="preserve">test-case-catalog-cnpd-24.3.md</w:t>
+            </w:r>
+          </w:p>
+        </w:tc>
+        <w:tc>
+          <w:tcPr/>
+          <w:p>
+            <w:pPr>
+              <w:pStyle w:val="Compact"/>
+              <w:jc w:val="left"/>
+            </w:pPr>
+            <w:r>
+              <w:t xml:space="preserve">Test Catalog</w:t>
+            </w:r>
+          </w:p>
+        </w:tc>
+        <w:tc>
+          <w:tcPr/>
+          <w:p>
+            <w:pPr>
+              <w:pStyle w:val="Compact"/>
+              <w:jc w:val="left"/>
+            </w:pPr>
+            <w:r>
+              <w:t xml:space="preserve">Test cases with validates/preconditions/pass criteria</w:t>
+            </w:r>
+          </w:p>
+        </w:tc>
+        <w:tc>
+          <w:tcPr/>
+          <w:p>
+            <w:pPr>
+              <w:pStyle w:val="Compact"/>
+              <w:jc w:val="left"/>
+            </w:pPr>
+            <w:r>
+              <w:t xml:space="preserve">Test plan / test repository (ALM/Xray/TestRail, Excel)</w:t>
+            </w:r>
+          </w:p>
+        </w:tc>
+      </w:tr>
+      <w:tr>
+        <w:tc>
+          <w:tcPr/>
+          <w:p>
+            <w:pPr>
+              <w:pStyle w:val="Compact"/>
+              <w:jc w:val="left"/>
+            </w:pPr>
+            <w:r>
               <w:t xml:space="preserve">8</w:t>
             </w:r>
           </w:p>
@@ -647,7 +771,7 @@
               <w:jc w:val="left"/>
             </w:pPr>
             <w:r>
-              <w:t xml:space="preserve">defect-register-dmc-24.3.md</w:t>
+              <w:t xml:space="preserve">defect-register-cnpd-24.3.md</w:t>
             </w:r>
           </w:p>
         </w:tc>
@@ -852,7 +976,7 @@
         <w:pStyle w:val="FirstParagraph"/>
       </w:pPr>
       <w:r>
-        <w:t xml:space="preserve">Real release notes are published per CNF (containerized network function) by the vendor, not as one consolidated DMC note. So instead of file #1 above, reality gives you:</w:t>
+        <w:t xml:space="preserve">Real release notes are published per CNF (containerized network function) by the vendor, not as one consolidated CNPD note. So instead of file #1 above, reality gives you:</w:t>
       </w:r>
     </w:p>
     <w:p>
@@ -864,7 +988,7 @@
         <w:pStyle w:val="Compact"/>
       </w:pPr>
       <w:r>
-        <w:t xml:space="preserve">release-note-cSAEGW-C-</w:t>
+        <w:t xml:space="preserve">release-note-SAEGW-C-</w:t>
       </w:r>
       <w:r>
         <w:t xml:space="preserve"> </w:t>
@@ -882,7 +1006,7 @@
         <w:pStyle w:val="Compact"/>
       </w:pPr>
       <w:r>
-        <w:t xml:space="preserve">release-note-cSAEGW-U-</w:t>
+        <w:t xml:space="preserve">release-note-SAEGW-U-</w:t>
       </w:r>
       <w:r>
         <w:t xml:space="preserve"> </w:t>
@@ -900,7 +1024,7 @@
         <w:pStyle w:val="Compact"/>
       </w:pPr>
       <w:r>
-        <w:t xml:space="preserve">release-note-cMME-</w:t>
+        <w:t xml:space="preserve">release-note-MME-</w:t>
       </w:r>
     </w:p>
     <w:p>

</xml_diff>